<commit_message>
cession: merge PV variables into standard template, remove unused _A variant and _cession_md folder
</commit_message>
<xml_diff>
--- a/templates/_Cession_SARL/PV-AGE-Cession_Template.docx
+++ b/templates/_Cession_SARL/PV-AGE-Cession_Template.docx
@@ -315,6 +315,126 @@
           <w:szCs w:val="22"/>
         </w:rPr>
         <w:t xml:space="preserve">Tous pouvoirs sont donnes a {{ CEDANT_NOM_COMPLET }}, pour effectuer toutes formalites de depot et d'inscription modificative aupres du greffe du tribunal de commerce, ainsi que toutes autres demarches requises par la loi.</w:t>
+      </w:r>
+    </w:p>
+    <w:p>
+      <w:pPr>
+        <w:jc w:val="center"/>
+      </w:pPr>
+      <w:r>
+        <w:rPr>
+          <w:sz w:val="22"/>
+          <w:szCs w:val="22"/>
+          <w:b w:val="1"/>
+          <w:bCs w:val="1"/>
+        </w:rPr>
+        <w:t xml:space="preserve">ORDRE DU JOUR DETAILLE :</w:t>
+      </w:r>
+    </w:p>
+    <w:p>
+      <w:pPr/>
+      <w:r>
+        <w:rPr>
+          <w:sz w:val="22"/>
+          <w:szCs w:val="22"/>
+        </w:rPr>
+        <w:t xml:space="preserve">{{ PV_ORDER_ITEMS }}</w:t>
+      </w:r>
+    </w:p>
+    <w:p>
+      <w:pPr>
+        <w:jc w:val="center"/>
+      </w:pPr>
+      <w:r>
+        <w:rPr>
+          <w:sz w:val="22"/>
+          <w:szCs w:val="22"/>
+          <w:b w:val="1"/>
+          <w:bCs w:val="1"/>
+        </w:rPr>
+        <w:t xml:space="preserve">{{ PV_TITLE_1 }}</w:t>
+      </w:r>
+    </w:p>
+    <w:p>
+      <w:pPr/>
+      <w:r>
+        <w:rPr>
+          <w:sz w:val="22"/>
+          <w:szCs w:val="22"/>
+        </w:rPr>
+        <w:t xml:space="preserve">{{ PV_RESOLUTION_1 }}</w:t>
+      </w:r>
+    </w:p>
+    <w:p>
+      <w:pPr>
+        <w:jc w:val="center"/>
+      </w:pPr>
+      <w:r>
+        <w:rPr>
+          <w:sz w:val="22"/>
+          <w:szCs w:val="22"/>
+          <w:b w:val="1"/>
+          <w:bCs w:val="1"/>
+        </w:rPr>
+        <w:t xml:space="preserve">{{ PV_TITLE_2 }}</w:t>
+      </w:r>
+    </w:p>
+    <w:p>
+      <w:pPr/>
+      <w:r>
+        <w:rPr>
+          <w:sz w:val="22"/>
+          <w:szCs w:val="22"/>
+        </w:rPr>
+        <w:t xml:space="preserve">{{ PV_RESOLUTION_2 }}</w:t>
+      </w:r>
+    </w:p>
+    <w:p>
+      <w:pPr>
+        <w:jc w:val="center"/>
+      </w:pPr>
+      <w:r>
+        <w:rPr>
+          <w:sz w:val="22"/>
+          <w:szCs w:val="22"/>
+          <w:b w:val="1"/>
+          <w:bCs w:val="1"/>
+        </w:rPr>
+        <w:t xml:space="preserve">{{ PV_TITLE_3 }}</w:t>
+      </w:r>
+    </w:p>
+    <w:p>
+      <w:pPr/>
+      <w:r>
+        <w:rPr>
+          <w:sz w:val="22"/>
+          <w:szCs w:val="22"/>
+        </w:rPr>
+        <w:t xml:space="preserve">{{ PV_RESOLUTION_3 }}</w:t>
+      </w:r>
+    </w:p>
+    <w:p>
+      <w:pPr>
+        <w:jc w:val="center"/>
+      </w:pPr>
+      <w:r>
+        <w:rPr>
+          <w:sz w:val="22"/>
+          <w:szCs w:val="22"/>
+          <w:b w:val="1"/>
+          <w:bCs w:val="1"/>
+        </w:rPr>
+        <w:t xml:space="preserve">{{ PV_TITLE_4 }}</w:t>
+      </w:r>
+    </w:p>
+    <w:p>
+      <w:pPr/>
+      <w:r>
+        <w:rPr>
+          <w:sz w:val="22"/>
+          <w:szCs w:val="22"/>
+        </w:rPr>
+        <w:t xml:space="preserve">{{ PV_RESOLUTION_4 }}</w:t>
       </w:r>
     </w:p>
     <w:p>

</xml_diff>

<commit_message>
fix(docx): supprime ORDRE JOUR et resolutions hardcodes des PV-AGE-Cession, garde seulement ORDRE JOUR DETAILLE
</commit_message>
<xml_diff>
--- a/templates/_Cession_SARL/PV-AGE-Cession_Template.docx
+++ b/templates/_Cession_SARL/PV-AGE-Cession_Template.docx
@@ -129,192 +129,6 @@
           <w:szCs w:val="22"/>
         </w:rPr>
         <w:t xml:space="preserve">Apres avoir constate que toutes les dispositions legales et statutaires ont ete respectees, l'Associe Unique examine l'ordre du jour suivant :</w:t>
-      </w:r>
-    </w:p>
-    <w:p>
-      <w:pPr>
-        <w:jc w:val="center"/>
-      </w:pPr>
-      <w:r>
-        <w:rPr>
-          <w:sz w:val="22"/>
-          <w:szCs w:val="22"/>
-          <w:b w:val="1"/>
-          <w:bCs w:val="1"/>
-        </w:rPr>
-        <w:t xml:space="preserve">ORDRE DU JOUR :</w:t>
-      </w:r>
-    </w:p>
-    <w:p>
-      <w:pPr/>
-      <w:r>
-        <w:rPr>
-          <w:sz w:val="22"/>
-          <w:szCs w:val="22"/>
-        </w:rPr>
-        <w:t xml:space="preserve">1. Cession de parts sociales par l'associe unique</w:t>
-      </w:r>
-    </w:p>
-    <w:p>
-      <w:pPr/>
-      <w:r>
-        <w:rPr>
-          <w:sz w:val="22"/>
-          <w:szCs w:val="22"/>
-        </w:rPr>
-        <w:t xml:space="preserve">2. Agrement du ou des nouveaux associes</w:t>
-      </w:r>
-    </w:p>
-    <w:p>
-      <w:pPr/>
-      <w:r>
-        <w:rPr>
-          <w:sz w:val="22"/>
-          <w:szCs w:val="22"/>
-        </w:rPr>
-        <w:t xml:space="preserve">3. Modification des statuts (article relatif aux associes et au capital social)</w:t>
-      </w:r>
-    </w:p>
-    <w:p>
-      <w:pPr/>
-      <w:r>
-        <w:rPr>
-          <w:sz w:val="22"/>
-          <w:szCs w:val="22"/>
-        </w:rPr>
-        <w:t xml:space="preserve">4. Pouvoirs pour formalites</w:t>
-      </w:r>
-    </w:p>
-    <w:p>
-      <w:pPr/>
-      <w:r>
-        <w:rPr>
-          <w:sz w:val="22"/>
-          <w:szCs w:val="22"/>
-          <w:b w:val="1"/>
-          <w:bCs w:val="1"/>
-        </w:rPr>
-        <w:t xml:space="preserve">1. Cession de parts sociales</w:t>
-      </w:r>
-    </w:p>
-    <w:p>
-      <w:pPr/>
-      <w:r>
-        <w:rPr>
-          <w:sz w:val="22"/>
-          <w:szCs w:val="22"/>
-        </w:rPr>
-        <w:t xml:space="preserve">L'Associe Unique {{ CEDANT_NOM_COMPLET }}, titulaire de la totalite des parts sociales de la societe, declare ceder a {{ CESSIONNAIRE_CIVILITE }} {{ CESSIONNAIRE_NOM_COMPLET }}, de nationalite {{ CESSIONNAIRE_NATIONALITE }}, demeurant a {{ CESSIONNAIRE_ADRESSE }}, {{ PARTS_CEDEES }} parts sociales de {{ SOCIETE_VALEUR_NOMINALE }} DH chacune, pour un montant total de {{ PRIX_TOTAL }} DH.</w:t>
-      </w:r>
-    </w:p>
-    <w:p>
-      <w:pPr/>
-      <w:r>
-        <w:rPr>
-          <w:sz w:val="22"/>
-          <w:szCs w:val="22"/>
-        </w:rPr>
-        <w:t xml:space="preserve">L'Associe Unique accepte expressement cette cession et reconnait que le prix de cession a ete regle entre les parties.</w:t>
-      </w:r>
-    </w:p>
-    <w:p>
-      <w:pPr/>
-      <w:r>
-        <w:rPr>
-          <w:sz w:val="22"/>
-          <w:szCs w:val="22"/>
-          <w:b w:val="1"/>
-          <w:bCs w:val="1"/>
-        </w:rPr>
-        <w:t xml:space="preserve">2. Agrement</w:t>
-      </w:r>
-    </w:p>
-    <w:p>
-      <w:pPr/>
-      <w:r>
-        <w:rPr>
-          <w:sz w:val="22"/>
-          <w:szCs w:val="22"/>
-        </w:rPr>
-        <w:t xml:space="preserve">L'Associe Unique agree la cession susmentionnee et accepte l'entree du nouvel associe dans le capital social de la societe.</w:t>
-      </w:r>
-    </w:p>
-    <w:p>
-      <w:pPr/>
-      <w:r>
-        <w:rPr>
-          <w:sz w:val="22"/>
-          <w:szCs w:val="22"/>
-          <w:b w:val="1"/>
-          <w:bCs w:val="1"/>
-        </w:rPr>
-        <w:t xml:space="preserve">3. Modification des statuts</w:t>
-      </w:r>
-    </w:p>
-    <w:p>
-      <w:pPr/>
-      <w:r>
-        <w:rPr>
-          <w:sz w:val="22"/>
-          <w:szCs w:val="22"/>
-        </w:rPr>
-        <w:t xml:space="preserve">En consequence de la cession, l'Associe Unique decide de modifier l'article 7 des statuts relatif a la repartition du capital social, lequel sera desormais redige comme suit :</w:t>
-      </w:r>
-    </w:p>
-    <w:p>
-      <w:pPr>
-        <w:jc w:val="center"/>
-      </w:pPr>
-      <w:r>
-        <w:rPr>
-          <w:sz w:val="22"/>
-          <w:szCs w:val="22"/>
-          <w:b w:val="1"/>
-          <w:bCs w:val="1"/>
-        </w:rPr>
-        <w:t xml:space="preserve">Article 7 - Capital Social</w:t>
-      </w:r>
-    </w:p>
-    <w:p>
-      <w:pPr/>
-      <w:r>
-        <w:rPr>
-          <w:sz w:val="22"/>
-          <w:szCs w:val="22"/>
-        </w:rPr>
-        <w:t xml:space="preserve">Le capital social est fixe a la somme de {{ SOCIETE_CAPITAL }} DH, divise en {{ SOCIETE_PART_SOCIAL }} parts sociales de {{ SOCIETE_VALEUR_NOMINALE }} DH chacune, reparties comme suit :</w:t>
-      </w:r>
-    </w:p>
-    <w:p>
-      <w:pPr/>
-      <w:r>
-        <w:rPr>
-          <w:sz w:val="22"/>
-          <w:szCs w:val="22"/>
-        </w:rPr>
-        <w:t xml:space="preserve">- {{ CESSIONNAIRE_NOM_COMPLET }} : {{ PARTS_CEDEES }} parts</w:t>
-      </w:r>
-    </w:p>
-    <w:p>
-      <w:pPr/>
-      <w:r>
-        <w:rPr>
-          <w:sz w:val="22"/>
-          <w:szCs w:val="22"/>
-          <w:b w:val="1"/>
-          <w:bCs w:val="1"/>
-        </w:rPr>
-        <w:t xml:space="preserve">4. Pouvoirs</w:t>
-      </w:r>
-    </w:p>
-    <w:p>
-      <w:pPr/>
-      <w:r>
-        <w:rPr>
-          <w:sz w:val="22"/>
-          <w:szCs w:val="22"/>
-        </w:rPr>
-        <w:t xml:space="preserve">Tous pouvoirs sont donnes a {{ CEDANT_NOM_COMPLET }}, pour effectuer toutes formalites de depot et d'inscription modificative aupres du greffe du tribunal de commerce, ainsi que toutes autres demarches requises par la loi.</w:t>
       </w:r>
     </w:p>
     <w:p>

</xml_diff>

<commit_message>
feat(docx): remplace PV_TITLE/PV_RESOLUTION fixes par boucle {%p for r in pv_resolutions %}
</commit_message>
<xml_diff>
--- a/templates/_Cession_SARL/PV-AGE-Cession_Template.docx
+++ b/templates/_Cession_SARL/PV-AGE-Cession_Template.docx
@@ -152,7 +152,7 @@
           <w:sz w:val="22"/>
           <w:szCs w:val="22"/>
         </w:rPr>
-        <w:t xml:space="preserve">{{ PV_ORDER_ITEMS }}</w:t>
+        <w:t xml:space="preserve">{%p for r in pv_resolutions %}</w:t>
       </w:r>
     </w:p>
     <w:p>
@@ -166,89 +166,27 @@
           <w:b w:val="1"/>
           <w:bCs w:val="1"/>
         </w:rPr>
-        <w:t xml:space="preserve">{{ PV_TITLE_1 }}</w:t>
-      </w:r>
-    </w:p>
-    <w:p>
-      <w:pPr/>
-      <w:r>
-        <w:rPr>
-          <w:sz w:val="22"/>
-          <w:szCs w:val="22"/>
-        </w:rPr>
-        <w:t xml:space="preserve">{{ PV_RESOLUTION_1 }}</w:t>
-      </w:r>
-    </w:p>
-    <w:p>
-      <w:pPr>
-        <w:jc w:val="center"/>
-      </w:pPr>
-      <w:r>
-        <w:rPr>
-          <w:sz w:val="22"/>
-          <w:szCs w:val="22"/>
-          <w:b w:val="1"/>
-          <w:bCs w:val="1"/>
-        </w:rPr>
-        <w:t xml:space="preserve">{{ PV_TITLE_2 }}</w:t>
-      </w:r>
-    </w:p>
-    <w:p>
-      <w:pPr/>
-      <w:r>
-        <w:rPr>
-          <w:sz w:val="22"/>
-          <w:szCs w:val="22"/>
-        </w:rPr>
-        <w:t xml:space="preserve">{{ PV_RESOLUTION_2 }}</w:t>
-      </w:r>
-    </w:p>
-    <w:p>
-      <w:pPr>
-        <w:jc w:val="center"/>
-      </w:pPr>
-      <w:r>
-        <w:rPr>
-          <w:sz w:val="22"/>
-          <w:szCs w:val="22"/>
-          <w:b w:val="1"/>
-          <w:bCs w:val="1"/>
-        </w:rPr>
-        <w:t xml:space="preserve">{{ PV_TITLE_3 }}</w:t>
-      </w:r>
-    </w:p>
-    <w:p>
-      <w:pPr/>
-      <w:r>
-        <w:rPr>
-          <w:sz w:val="22"/>
-          <w:szCs w:val="22"/>
-        </w:rPr>
-        <w:t xml:space="preserve">{{ PV_RESOLUTION_3 }}</w:t>
-      </w:r>
-    </w:p>
-    <w:p>
-      <w:pPr>
-        <w:jc w:val="center"/>
-      </w:pPr>
-      <w:r>
-        <w:rPr>
-          <w:sz w:val="22"/>
-          <w:szCs w:val="22"/>
-          <w:b w:val="1"/>
-          <w:bCs w:val="1"/>
-        </w:rPr>
-        <w:t xml:space="preserve">{{ PV_TITLE_4 }}</w:t>
-      </w:r>
-    </w:p>
-    <w:p>
-      <w:pPr/>
-      <w:r>
-        <w:rPr>
-          <w:sz w:val="22"/>
-          <w:szCs w:val="22"/>
-        </w:rPr>
-        <w:t xml:space="preserve">{{ PV_RESOLUTION_4 }}</w:t>
+        <w:t xml:space="preserve">{{ r.TITLE }}</w:t>
+      </w:r>
+    </w:p>
+    <w:p>
+      <w:pPr/>
+      <w:r>
+        <w:rPr>
+          <w:sz w:val="22"/>
+          <w:szCs w:val="22"/>
+        </w:rPr>
+        <w:t xml:space="preserve">{{ r.CONTENT }}</w:t>
+      </w:r>
+    </w:p>
+    <w:p>
+      <w:pPr/>
+      <w:r>
+        <w:rPr>
+          <w:sz w:val="22"/>
+          <w:szCs w:val="22"/>
+        </w:rPr>
+        <w:t xml:space="preserve">{%p endfor %}</w:t>
       </w:r>
     </w:p>
     <w:p>

</xml_diff>